<commit_message>
Resume pass 2: expand skeletal DEP-02 (real values.yaml parameter matrix, HPA correction to fixed replicas, sizing tiers) and MNT-07 (certificate inventory, three renewal runbooks, expiry monitoring) from verified deployment facts; v3.2.0 revision rows; md twins synced
</commit_message>
<xml_diff>
--- a/technical_document/docx/03_maintenance/DOC-03-MNT-07_Enterprise_SSL_TLS_Certificate_Lifecycle_and_mTLS_Renewal.docx
+++ b/technical_document/docx/03_maintenance/DOC-03-MNT-07_Enterprise_SSL_TLS_Certificate_Lifecycle_and_mTLS_Renewal.docx
@@ -1604,6 +1604,58 @@
           </w:p>
         </w:tc>
       </w:tr>
+      <w:tr>
+        <w:tc>
+          <w:tcPr>
+            <w:tcW w:type="dxa" w:w="1872"/>
+          </w:tcPr>
+          <w:p>
+            <w:r>
+              <w:t>3.2.0</w:t>
+            </w:r>
+          </w:p>
+        </w:tc>
+        <w:tc>
+          <w:tcPr>
+            <w:tcW w:type="dxa" w:w="1872"/>
+          </w:tcPr>
+          <w:p>
+            <w:r>
+              <w:t>October 2026</w:t>
+            </w:r>
+          </w:p>
+        </w:tc>
+        <w:tc>
+          <w:tcPr>
+            <w:tcW w:type="dxa" w:w="1872"/>
+          </w:tcPr>
+          <w:p>
+            <w:r>
+              <w:t>Independent Forensic Re-audit (content expansion)</w:t>
+            </w:r>
+          </w:p>
+        </w:tc>
+        <w:tc>
+          <w:tcPr>
+            <w:tcW w:type="dxa" w:w="1872"/>
+          </w:tcPr>
+          <w:p>
+            <w:r>
+              <w:t>Skeletal sections expanded with verified deploy/chart/ulms values and real TLS anchors</w:t>
+            </w:r>
+          </w:p>
+        </w:tc>
+        <w:tc>
+          <w:tcPr>
+            <w:tcW w:type="dxa" w:w="1872"/>
+          </w:tcPr>
+          <w:p>
+            <w:r>
+              <w:t>Applied</w:t>
+            </w:r>
+          </w:p>
+        </w:tc>
+      </w:tr>
     </w:tbl>
     <w:p>
       <w:pPr>
@@ -2178,6 +2230,39 @@
         <w:t>Expansion pending (flagged by the forensic re-audit): this runbook currently covers topology + cert-manager renewal only; keystore/truststore rotation, expiry monitoring/alerting, and mTLS client-cert rollover procedures are required before operational use.</w:t>
       </w:r>
     </w:p>
+    <w:p>
+      <w:r>
+        <w:rPr>
+          <w:b/>
+        </w:rPr>
+        <w:t>Expanded Content — v3.2.0 (real TLS anchors: ingress ulms-tls, Fineract in-cluster 8443 mTLS, CIB PKCS12)</w:t>
+      </w:r>
+    </w:p>
+    <w:p>
+      <w:r>
+        <w:t>Certificate inventory (verified from the deployment): (1) Ingress/public TLS — Secret ulms-tls bound via ingress.tls in deploy/chart/ulms/values.yaml; issued by cert-manager or the bank CA. (2) Fineract in-cluster mTLS — the API reaches Fineract at https://fineract:8443/fineract-provider (FINERACT_URL); the client truststore must trust the Fineract server cert. (3) CIB client certificate — PKCS12 keystore mounted at ULMS_CIB_KEYSTORE (cib-live profile), passphrase ULMS_CIB_KEYSTORE_PASSWORD in the ulms-api-secrets Secret. (4) Keycloak browser-facing TLS on the external route (reverse-proxy terminated in compose; ingress-terminated in k3s).</w:t>
+      </w:r>
+    </w:p>
+    <w:p>
+      <w:r>
+        <w:t>Renewal runbook — public/ingress cert: cert-manager renews automatically; verify with kubectl get certificate -n ulms and force with kubectl delete secret ulms-tls (cert-manager re-issues). Bank-CA route: generate a CSR, obtain the signed cert, then kubectl create secret tls ulms-tls --cert=ulms.crt --key=ulms.key --dry-run=client -o yaml | kubectl apply -f - and roll the web ingress (kubectl rollout restart deployment/ulms-web).</w:t>
+      </w:r>
+    </w:p>
+    <w:p>
+      <w:r>
+        <w:t>Renewal runbook — Fineract mTLS truststore: replace the Fineract server certificate (helm upgrade with the new fineract image/secret), update the API client truststore Secret, then kubectl rollout restart deployment/ulms-api; verify from inside the pod with a health probe against FINERACT_URL over TLS.</w:t>
+      </w:r>
+    </w:p>
+    <w:p>
+      <w:r>
+        <w:t>Renewal runbook — CIB client certificate (BB annual rotation): obtain the new PKCS12 from BB CIB administration, update the mounted keystore and ULMS_CIB_KEYSTORE_PASSWORD in ulms-api-secrets, restart the API, and confirm a test CIB inquiry in the cib-live window before the old cert expires — schedule at least 15 days ahead of expiry.</w:t>
+      </w:r>
+    </w:p>
+    <w:p>
+      <w:r>
+        <w:t>Expiry monitoring: export certificate-notAfter from the ingress (kube-state-metrics or cert-manager metrics) and alert at 30/15/7 days via the observability stack; track the CIB keystore expiry in the ops calendar with a 30-day pre-alert — a missed CIB rotation blocks all CIB inquiries (a SEV-2 per TS-06).</w:t>
+      </w:r>
+    </w:p>
     <w:sectPr>
       <w:headerReference w:type="default" r:id="rId9"/>
       <w:footerReference w:type="default" r:id="rId10"/>

</xml_diff>